<commit_message>
feat(abonnement): facture d'abonnement émise automatiquement par JUPSER dans son dossier interne à chaque paiement confirmé (conversion au cours BCC, TVA du pack, facture normalisée), consultable par le client, relance depuis la console
Co-Authored-By: Claude Opus 5.5 <noreply@anthropic.com>
Claude-Session: https://claude.ai/code/session_01PES9v2QUtNkt2rhV2e9a8j
</commit_message>
<xml_diff>
--- a/docs/manuels/word/04_FEUILLE_DE_ROUTE_LANCEMENT.docx
+++ b/docs/manuels/word/04_FEUILLE_DE_ROUTE_LANCEMENT.docx
@@ -1872,6 +1872,27 @@
       </w:r>
       <w:r>
         <w:t xml:space="preserve">) — HTTPS automatique, réseau interne, sauvegardes chiffrées quotidiennes, secrets générés, amorçage sans données de démonstration, publication de l’image par GitHub Actions.</w:t>
+      </w:r>
+    </w:p>
+    <w:p>
+      <w:pPr>
+        <w:numPr>
+          <w:ilvl w:val="0"/>
+          <w:numId w:val="1001"/>
+        </w:numPr>
+      </w:pPr>
+      <w:r>
+        <w:rPr>
+          <w:bCs/>
+          <w:b/>
+        </w:rPr>
+        <w:t xml:space="preserve">Abonnements</w:t>
+      </w:r>
+      <w:r>
+        <w:t xml:space="preserve"> </w:t>
+      </w:r>
+      <w:r>
+        <w:t xml:space="preserve">: passage automatique de l’essai au payant, rappels, factures d’abonnement émises par JUPSER dans son propre dossier (facture normalisée), réinitialisation du mot de passe par courriel.</w:t>
       </w:r>
     </w:p>
     <w:p>

</xml_diff>